<commit_message>
rfb: remove legacy ContentCache protocol; unify on PersistentCache
Drop the session-only ContentCache message types and rectangle encodings
(RequestCachedData/CacheEviction, CachedRect/CachedRectInit) and route all
cache queries/evictions through the PersistentCache protocol instead.

- Remove ContentCache reader/writer APIs and handler hooks
- Always use PersistentCacheQuery + batched PersistentCache evictions
- Simplify cache negotiation checks to pseudoEncodingPersistentCache only
- Delete CachedRectInit pending/known-ID tracking tied to ContentCache
- Keep encoding name parsing backwards-friendly by mapping CachedRect*
 to PersistentCachedRect* names
- Add ShiftTolerantScan unit tests and wire them into the unit test build
 and run_tests.sh
</commit_message>
<xml_diff>
--- a/docs/TigerVNC_Shift_Tolerant_Cache_Scan_Design_Spec.docx
+++ b/docs/TigerVNC_Shift_Tolerant_Cache_Scan_Design_Spec.docx
@@ -970,6 +970,86 @@
         <w:br/>
       </w:r>
     </w:p>
+    <w:p>
+      <w:pPr>
+        <w:pStyle w:val="Heading2"/>
+      </w:pPr>
+      <w:r>
+        <w:t>Implementation Status (2026-01-17)</w:t>
+      </w:r>
+    </w:p>
+    <w:p>
+      <w:pPr>
+        <w:pStyle w:val="ListBullet"/>
+      </w:pPr>
+      <w:r>
+        <w:t>CPU-only shift-tolerant scan stage implemented: multi-phase tile scan, greedy packing, exact hash verification, and cached-rect emission.</w:t>
+      </w:r>
+    </w:p>
+    <w:p>
+      <w:pPr>
+        <w:pStyle w:val="ListBullet"/>
+      </w:pPr>
+      <w:r>
+        <w:t>Integrated into server EncodeManager after CopyRect emission; emitted regions are subtracted from remaining damage before normal encoding.</w:t>
+      </w:r>
+    </w:p>
+    <w:p>
+      <w:pPr>
+        <w:pStyle w:val="ListBullet"/>
+      </w:pPr>
+      <w:r>
+        <w:t>Guarded by existing feature flag and requires LastRect to allow variable rect counts.</w:t>
+      </w:r>
+    </w:p>
+    <w:p>
+      <w:pPr>
+        <w:pStyle w:val="ListBullet"/>
+      </w:pPr>
+      <w:r>
+        <w:t>Build verified on macOS (viewer) and Linux (server).</w:t>
+      </w:r>
+    </w:p>
+    <w:p>
+      <w:pPr>
+        <w:pStyle w:val="Heading2"/>
+      </w:pPr>
+      <w:r>
+        <w:t>Planned Follow-on Work</w:t>
+      </w:r>
+    </w:p>
+    <w:p>
+      <w:pPr>
+        <w:pStyle w:val="ListBullet"/>
+      </w:pPr>
+      <w:r>
+        <w:t>Add volatility/churn map barriers (Phase 2) to avoid packing across frequently changing UI tiles.</w:t>
+      </w:r>
+    </w:p>
+    <w:p>
+      <w:pPr>
+        <w:pStyle w:val="ListBullet"/>
+      </w:pPr>
+      <w:r>
+        <w:t>Add adaptive per-frame scan budgeting (Phase 2) using throughput/backlog signals.</w:t>
+      </w:r>
+    </w:p>
+    <w:p>
+      <w:pPr>
+        <w:pStyle w:val="ListBullet"/>
+      </w:pPr>
+      <w:r>
+        <w:t>Add unit/e2e tests and telemetry improvements to support tuning and regressions.</w:t>
+      </w:r>
+    </w:p>
+    <w:p>
+      <w:pPr>
+        <w:pStyle w:val="ListBullet"/>
+      </w:pPr>
+      <w:r>
+        <w:t>Consider GPU prehash backend (Phase 3) once CPU path is stable and measured.</w:t>
+      </w:r>
+    </w:p>
     <w:sectPr>
       <w:pgSz w:w="12240" w:h="15840"/>
       <w:pgMar w:top="1440" w:right="1800" w:bottom="1440" w:left="1800" w:header="720" w:footer="720" w:gutter="0"/>

</xml_diff>